<commit_message>
docs(figures): 安装 Graphviz 16.1.0 并按图择优选用引擎
对比结论（两套引擎各渲一遍后逐张目检）：
- 用例图/ER 图：Graphviz(dot) 明显更好 —— 正交折线、不绕框、无长弧；改用 dot
- 架构图/状态机/语音中继：保留内置 Smetana —— dot 版会把"权限引擎"框压到 Service 层边框上
- 活动图/时序图：两个引擎输出完全相同（不走图布局引擎）

工程：choco 安装 graphviz 16.1.0 到 C:\Program Files\Graphviz（PATH 已生效）；
fig4-2-er.puml 移除 smetana pragma 改走 dot，其余保留 pragma；重新生成三份文档。
</commit_message>
<xml_diff>
--- a/docs/毕业论文.docx
+++ b/docs/毕业论文.docx
@@ -2912,7 +2912,7 @@
       <w:r>
         <w:drawing>
           <wp:inline distT="0" distB="0" distL="0" distR="0">
-            <wp:extent cx="5524500" cy="4200525"/>
+            <wp:extent cx="5524500" cy="4162425"/>
             <wp:effectExtent t="0" r="0" b="0" l="0"/>
             <wp:docPr id="1" name="" descr="" title=""/>
             <wp:cNvGraphicFramePr>
@@ -2937,7 +2937,7 @@
                   <pic:spPr bwMode="auto">
                     <a:xfrm>
                       <a:off x="0" y="0"/>
-                      <a:ext cx="5524500" cy="4200525"/>
+                      <a:ext cx="5524500" cy="4162425"/>
                     </a:xfrm>
                     <a:prstGeom prst="rect">
                       <a:avLst/>

</xml_diff>